<commit_message>
test: pin merged-table row deletion structure
</commit_message>
<xml_diff>
--- a/parity/fixtures/edit-merged-table-seed.docx
+++ b/parity/fixtures/edit-merged-table-seed.docx
@@ -65,6 +65,11 @@
         </w:tc>
       </w:tr>
     </w:tbl>
+    <w:p>
+      <w:r>
+        <w:t>After table 79.</w:t>
+      </w:r>
+    </w:p>
     <w:sectPr>
       <w:pgSz w:w="12240" w:h="15840"/>
       <w:pgMar w:top="1440" w:right="1440" w:bottom="1440" w:left="1440"/>

</xml_diff>